<commit_message>
L endpoint tambe, i el handoff encara no es pot donar per tancat
L Adria tenia la contrasenya des d ahir i no sabia on connectar-se: li faltava
192.168.11.238:1433, BD IntercanviSAP. Enviat el 17/09.

Ahir es va apuntar el Bloc B com a tancat i era prematur. La lliço es la mateixa
de tota la setmana, i ja van quatre: fins que algu no recorre el cami sencer,
allo esta fet sobre el paper. Queda obert fins que confirmi que ha connectat.

Si li falla, el primer a mirar no es la credencial sino si la VPN encamina cap
a 192.168.11.x: els clients de VPN surten per 192.168.254.x, i que Sistemes els
habilitessin l acces no vol dir automaticament que la ruta hi sigui.

Co-Authored-By: Claude Opus 5 (1M context) <noreply@anthropic.com>
</commit_message>
<xml_diff>
--- a/correu_sistemes_2026-09-07.docx
+++ b/correu_sistemes_2026-09-07.docx
@@ -4,6 +4,7 @@
   <w:body>
     <w:p>
       <w:pPr>
+        <w:ind w:firstLine="720"/>
         <w:rPr>
           <w:lang w:val="es-ES"/>
         </w:rPr>
@@ -223,7 +224,21 @@
         <w:rPr>
           <w:lang w:val="es-ES"/>
         </w:rPr>
-        <w:t xml:space="preserve"> per SQL. </w:t>
+        <w:t xml:space="preserve"> </w:t>
+      </w:r>
+      <w:proofErr w:type="gramStart"/>
+      <w:r>
+        <w:rPr>
+          <w:lang w:val="es-ES"/>
+        </w:rPr>
+        <w:t>per SQL</w:t>
+      </w:r>
+      <w:proofErr w:type="gramEnd"/>
+      <w:r>
+        <w:rPr>
+          <w:lang w:val="es-ES"/>
+        </w:rPr>
+        <w:t xml:space="preserve">. </w:t>
       </w:r>
       <w:proofErr w:type="spellStart"/>
       <w:r>
@@ -999,8 +1014,16 @@
         <w:rPr>
           <w:b w:val="0"/>
         </w:rPr>
-        <w:t>1 i 2 — VPN i port 1433 per a Analitza</w:t>
-      </w:r>
+        <w:t xml:space="preserve">1 i 2 — VPN i port 1433 per </w:t>
+      </w:r>
+      <w:proofErr w:type="gramStart"/>
+      <w:r>
+        <w:rPr>
+          <w:b w:val="0"/>
+        </w:rPr>
+        <w:t>a Analitza</w:t>
+      </w:r>
+      <w:proofErr w:type="gramEnd"/>
     </w:p>
     <w:p>
       <w:pPr>
@@ -1407,7 +1430,21 @@
         <w:rPr>
           <w:lang w:val="es-ES"/>
         </w:rPr>
-        <w:t xml:space="preserve"> que entren per VPN, un </w:t>
+        <w:t xml:space="preserve"> que entren </w:t>
+      </w:r>
+      <w:proofErr w:type="gramStart"/>
+      <w:r>
+        <w:rPr>
+          <w:lang w:val="es-ES"/>
+        </w:rPr>
+        <w:t>per VPN</w:t>
+      </w:r>
+      <w:proofErr w:type="gramEnd"/>
+      <w:r>
+        <w:rPr>
+          <w:lang w:val="es-ES"/>
+        </w:rPr>
+        <w:t xml:space="preserve">, un </w:t>
       </w:r>
       <w:proofErr w:type="spellStart"/>
       <w:r>
@@ -2924,6 +2961,7 @@
         <w:t xml:space="preserve"> (</w:t>
       </w:r>
       <w:proofErr w:type="spellStart"/>
+      <w:proofErr w:type="gramStart"/>
       <w:r>
         <w:rPr>
           <w:rFonts w:ascii="Consolas" w:hAnsi="Consolas"/>
@@ -2931,7 +2969,17 @@
           <w:sz w:val="20"/>
           <w:lang w:val="es-ES"/>
         </w:rPr>
-        <w:t>cfg.client_ship_no</w:t>
+        <w:t>cfg.client</w:t>
+      </w:r>
+      <w:proofErr w:type="gramEnd"/>
+      <w:r>
+        <w:rPr>
+          <w:rFonts w:ascii="Consolas" w:hAnsi="Consolas"/>
+          <w:color w:val="333333"/>
+          <w:sz w:val="20"/>
+          <w:lang w:val="es-ES"/>
+        </w:rPr>
+        <w:t>_ship_no</w:t>
       </w:r>
       <w:proofErr w:type="spellEnd"/>
       <w:r>
@@ -10808,6 +10856,7 @@
         <w:t xml:space="preserve"> C:\Apps\SapB1AnalitzaSync /</w:t>
       </w:r>
       <w:proofErr w:type="spellStart"/>
+      <w:proofErr w:type="gramStart"/>
       <w:r>
         <w:rPr>
           <w:rFonts w:ascii="Consolas" w:hAnsi="Consolas"/>
@@ -10817,6 +10866,7 @@
         <w:t>inheritance:r</w:t>
       </w:r>
       <w:proofErr w:type="spellEnd"/>
+      <w:proofErr w:type="gramEnd"/>
     </w:p>
     <w:p>
       <w:pPr>
@@ -10828,7 +10878,43 @@
           <w:color w:val="333333"/>
           <w:sz w:val="18"/>
         </w:rPr>
-        <w:t>icacls C:\Apps\SapB1AnalitzaSync /grant:r "Administrators:(OI)(CI)(F)"</w:t>
+        <w:t>icacls C:\Apps\SapB1AnalitzaSync /</w:t>
+      </w:r>
+      <w:proofErr w:type="gramStart"/>
+      <w:r>
+        <w:rPr>
+          <w:rFonts w:ascii="Consolas" w:hAnsi="Consolas"/>
+          <w:color w:val="333333"/>
+          <w:sz w:val="18"/>
+        </w:rPr>
+        <w:t>grant:r</w:t>
+      </w:r>
+      <w:proofErr w:type="gramEnd"/>
+      <w:r>
+        <w:rPr>
+          <w:rFonts w:ascii="Consolas" w:hAnsi="Consolas"/>
+          <w:color w:val="333333"/>
+          <w:sz w:val="18"/>
+        </w:rPr>
+        <w:t xml:space="preserve"> "Administrators:(</w:t>
+      </w:r>
+      <w:proofErr w:type="gramStart"/>
+      <w:r>
+        <w:rPr>
+          <w:rFonts w:ascii="Consolas" w:hAnsi="Consolas"/>
+          <w:color w:val="333333"/>
+          <w:sz w:val="18"/>
+        </w:rPr>
+        <w:t>OI)(</w:t>
+      </w:r>
+      <w:proofErr w:type="gramEnd"/>
+      <w:r>
+        <w:rPr>
+          <w:rFonts w:ascii="Consolas" w:hAnsi="Consolas"/>
+          <w:color w:val="333333"/>
+          <w:sz w:val="18"/>
+        </w:rPr>
+        <w:t>CI)(F)"</w:t>
       </w:r>
     </w:p>
     <w:p>
@@ -10841,7 +10927,43 @@
           <w:color w:val="333333"/>
           <w:sz w:val="18"/>
         </w:rPr>
-        <w:t>icacls C:\Apps\SapB1AnalitzaSync /grant:r "SYSTEM:(OI)(CI)(F)"</w:t>
+        <w:t>icacls C:\Apps\SapB1AnalitzaSync /</w:t>
+      </w:r>
+      <w:proofErr w:type="gramStart"/>
+      <w:r>
+        <w:rPr>
+          <w:rFonts w:ascii="Consolas" w:hAnsi="Consolas"/>
+          <w:color w:val="333333"/>
+          <w:sz w:val="18"/>
+        </w:rPr>
+        <w:t>grant:r</w:t>
+      </w:r>
+      <w:proofErr w:type="gramEnd"/>
+      <w:r>
+        <w:rPr>
+          <w:rFonts w:ascii="Consolas" w:hAnsi="Consolas"/>
+          <w:color w:val="333333"/>
+          <w:sz w:val="18"/>
+        </w:rPr>
+        <w:t xml:space="preserve"> "SYSTEM:(</w:t>
+      </w:r>
+      <w:proofErr w:type="gramStart"/>
+      <w:r>
+        <w:rPr>
+          <w:rFonts w:ascii="Consolas" w:hAnsi="Consolas"/>
+          <w:color w:val="333333"/>
+          <w:sz w:val="18"/>
+        </w:rPr>
+        <w:t>OI)(</w:t>
+      </w:r>
+      <w:proofErr w:type="gramEnd"/>
+      <w:r>
+        <w:rPr>
+          <w:rFonts w:ascii="Consolas" w:hAnsi="Consolas"/>
+          <w:color w:val="333333"/>
+          <w:sz w:val="18"/>
+        </w:rPr>
+        <w:t>CI)(F)"</w:t>
       </w:r>
     </w:p>
     <w:p>
@@ -10872,6 +10994,7 @@
         <w:t xml:space="preserve"> C:\Apps\SapB1AnalitzaSync /</w:t>
       </w:r>
       <w:proofErr w:type="spellStart"/>
+      <w:proofErr w:type="gramStart"/>
       <w:r>
         <w:rPr>
           <w:rFonts w:ascii="Consolas" w:hAnsi="Consolas"/>
@@ -10882,6 +11005,7 @@
         <w:t>grant:r</w:t>
       </w:r>
       <w:proofErr w:type="spellEnd"/>
+      <w:proofErr w:type="gramEnd"/>
       <w:r>
         <w:rPr>
           <w:rFonts w:ascii="Consolas" w:hAnsi="Consolas"/>
@@ -10929,7 +11053,27 @@
           <w:sz w:val="18"/>
           <w:lang w:val="es-ES"/>
         </w:rPr>
-        <w:t>&gt;:(OI)(CI)(RX)"</w:t>
+        <w:t>&gt;:(</w:t>
+      </w:r>
+      <w:proofErr w:type="gramStart"/>
+      <w:r>
+        <w:rPr>
+          <w:rFonts w:ascii="Consolas" w:hAnsi="Consolas"/>
+          <w:color w:val="333333"/>
+          <w:sz w:val="18"/>
+          <w:lang w:val="es-ES"/>
+        </w:rPr>
+        <w:t>OI)(</w:t>
+      </w:r>
+      <w:proofErr w:type="gramEnd"/>
+      <w:r>
+        <w:rPr>
+          <w:rFonts w:ascii="Consolas" w:hAnsi="Consolas"/>
+          <w:color w:val="333333"/>
+          <w:sz w:val="18"/>
+          <w:lang w:val="es-ES"/>
+        </w:rPr>
+        <w:t>CI)(RX)"</w:t>
       </w:r>
     </w:p>
     <w:p>

</xml_diff>